<commit_message>
UML dijagrami aktivnosti po use caseovima
</commit_message>
<xml_diff>
--- a/UML_Dijagrami.docx
+++ b/UML_Dijagrami.docx
@@ -18,19 +18,7 @@
         <w:rPr>
           <w:lang w:val="hr-HR"/>
         </w:rPr>
-        <w:t xml:space="preserve"> (*možda treba još nešto dodati</w:t>
-      </w:r>
-      <w:r>
-        <w:rPr>
-          <w:lang w:val="hr-HR"/>
-        </w:rPr>
-        <w:t xml:space="preserve"> ili sitno prepraviti</w:t>
-      </w:r>
-      <w:r>
-        <w:rPr>
-          <w:lang w:val="hr-HR"/>
-        </w:rPr>
-        <w:t>)</w:t>
+        <w:t xml:space="preserve"> </w:t>
       </w:r>
     </w:p>
     <w:p>
@@ -94,6 +82,14 @@
           </wp:inline>
         </w:drawing>
       </w:r>
+    </w:p>
+    <w:p>
+      <w:pPr>
+        <w:jc w:val="center"/>
+        <w:rPr>
+          <w:lang w:val="hr-HR"/>
+        </w:rPr>
+      </w:pPr>
     </w:p>
     <w:p>
       <w:pPr>
@@ -183,15 +179,14 @@
       </w:pPr>
       <w:r>
         <w:rPr>
-          <w:noProof/>
           <w:lang w:val="hr-HR"/>
         </w:rPr>
         <w:lastRenderedPageBreak/>
         <w:drawing>
-          <wp:inline distT="0" distB="0" distL="0" distR="0" wp14:anchorId="6E79E310" wp14:editId="31DEA0FE">
-            <wp:extent cx="4143709" cy="6896100"/>
-            <wp:effectExtent l="0" t="0" r="0" b="0"/>
-            <wp:docPr id="1722749084" name="Slika 16"/>
+          <wp:inline distT="0" distB="0" distL="0" distR="0" wp14:anchorId="158A978B" wp14:editId="1D3F514C">
+            <wp:extent cx="2185761" cy="6019800"/>
+            <wp:effectExtent l="0" t="0" r="5080" b="0"/>
+            <wp:docPr id="1821797636" name="Slika 2"/>
             <wp:cNvGraphicFramePr>
               <a:graphicFrameLocks xmlns:a="http://schemas.openxmlformats.org/drawingml/2006/main" noChangeAspect="1"/>
             </wp:cNvGraphicFramePr>
@@ -199,7 +194,7 @@
               <a:graphicData uri="http://schemas.openxmlformats.org/drawingml/2006/picture">
                 <pic:pic xmlns:pic="http://schemas.openxmlformats.org/drawingml/2006/picture">
                   <pic:nvPicPr>
-                    <pic:cNvPr id="0" name="Picture 58"/>
+                    <pic:cNvPr id="0" name="Picture 6"/>
                     <pic:cNvPicPr>
                       <a:picLocks noChangeAspect="1" noChangeArrowheads="1"/>
                     </pic:cNvPicPr>
@@ -220,7 +215,7 @@
                   <pic:spPr bwMode="auto">
                     <a:xfrm>
                       <a:off x="0" y="0"/>
-                      <a:ext cx="4148648" cy="6904320"/>
+                      <a:ext cx="2197098" cy="6051025"/>
                     </a:xfrm>
                     <a:prstGeom prst="rect">
                       <a:avLst/>
@@ -246,15 +241,14 @@
       </w:pPr>
       <w:r>
         <w:rPr>
-          <w:noProof/>
           <w:lang w:val="hr-HR"/>
         </w:rPr>
         <w:lastRenderedPageBreak/>
         <w:drawing>
-          <wp:inline distT="0" distB="0" distL="0" distR="0" wp14:anchorId="3C4AC850" wp14:editId="0905DE77">
-            <wp:extent cx="1981200" cy="5311913"/>
+          <wp:inline distT="0" distB="0" distL="0" distR="0" wp14:anchorId="60738820" wp14:editId="3912B1E4">
+            <wp:extent cx="1876425" cy="4982814"/>
             <wp:effectExtent l="0" t="0" r="0" b="0"/>
-            <wp:docPr id="197191066" name="Slika 18"/>
+            <wp:docPr id="152435729" name="Slika 4"/>
             <wp:cNvGraphicFramePr>
               <a:graphicFrameLocks xmlns:a="http://schemas.openxmlformats.org/drawingml/2006/main" noChangeAspect="1"/>
             </wp:cNvGraphicFramePr>
@@ -262,7 +256,7 @@
               <a:graphicData uri="http://schemas.openxmlformats.org/drawingml/2006/picture">
                 <pic:pic xmlns:pic="http://schemas.openxmlformats.org/drawingml/2006/picture">
                   <pic:nvPicPr>
-                    <pic:cNvPr id="0" name="Picture 65"/>
+                    <pic:cNvPr id="0" name="Picture 13"/>
                     <pic:cNvPicPr>
                       <a:picLocks noChangeAspect="1" noChangeArrowheads="1"/>
                     </pic:cNvPicPr>
@@ -283,7 +277,7 @@
                   <pic:spPr bwMode="auto">
                     <a:xfrm>
                       <a:off x="0" y="0"/>
-                      <a:ext cx="1985437" cy="5323273"/>
+                      <a:ext cx="1892685" cy="5025993"/>
                     </a:xfrm>
                     <a:prstGeom prst="rect">
                       <a:avLst/>
@@ -307,126 +301,16 @@
           <w:lang w:val="hr-HR"/>
         </w:rPr>
       </w:pPr>
-    </w:p>
-    <w:p>
-      <w:pPr>
-        <w:jc w:val="center"/>
-        <w:rPr>
-          <w:lang w:val="hr-HR"/>
-        </w:rPr>
-      </w:pPr>
-    </w:p>
-    <w:p>
-      <w:pPr>
-        <w:jc w:val="center"/>
-        <w:rPr>
-          <w:lang w:val="hr-HR"/>
-        </w:rPr>
-      </w:pPr>
-    </w:p>
-    <w:p>
-      <w:pPr>
-        <w:jc w:val="center"/>
-        <w:rPr>
-          <w:lang w:val="hr-HR"/>
-        </w:rPr>
-      </w:pPr>
-    </w:p>
-    <w:p>
-      <w:pPr>
-        <w:jc w:val="center"/>
-        <w:rPr>
-          <w:lang w:val="hr-HR"/>
-        </w:rPr>
-      </w:pPr>
-    </w:p>
-    <w:p>
-      <w:pPr>
-        <w:jc w:val="center"/>
-        <w:rPr>
-          <w:lang w:val="hr-HR"/>
-        </w:rPr>
-      </w:pPr>
-    </w:p>
-    <w:p>
-      <w:pPr>
-        <w:jc w:val="center"/>
-        <w:rPr>
-          <w:lang w:val="hr-HR"/>
-        </w:rPr>
-      </w:pPr>
-    </w:p>
-    <w:p>
-      <w:pPr>
-        <w:jc w:val="center"/>
-        <w:rPr>
-          <w:lang w:val="hr-HR"/>
-        </w:rPr>
-      </w:pPr>
-    </w:p>
-    <w:p>
-      <w:pPr>
-        <w:jc w:val="center"/>
-        <w:rPr>
-          <w:lang w:val="hr-HR"/>
-        </w:rPr>
-      </w:pPr>
-    </w:p>
-    <w:p>
-      <w:pPr>
-        <w:jc w:val="center"/>
-        <w:rPr>
-          <w:lang w:val="hr-HR"/>
-        </w:rPr>
-      </w:pPr>
-    </w:p>
-    <w:p>
-      <w:pPr>
-        <w:jc w:val="center"/>
-        <w:rPr>
-          <w:lang w:val="hr-HR"/>
-        </w:rPr>
-      </w:pPr>
-    </w:p>
-    <w:p>
-      <w:pPr>
-        <w:jc w:val="center"/>
-        <w:rPr>
-          <w:lang w:val="hr-HR"/>
-        </w:rPr>
-      </w:pPr>
-    </w:p>
-    <w:p>
-      <w:pPr>
-        <w:rPr>
-          <w:lang w:val="hr-HR"/>
-        </w:rPr>
-      </w:pPr>
       <w:r>
         <w:rPr>
           <w:lang w:val="hr-HR"/>
         </w:rPr>
         <w:lastRenderedPageBreak/>
-        <w:t>3.10. UML dijagram uporabe</w:t>
-      </w:r>
-    </w:p>
-    <w:p>
-      <w:pPr>
-        <w:jc w:val="center"/>
-        <w:rPr>
-          <w:lang w:val="hr-HR"/>
-        </w:rPr>
-      </w:pPr>
-      <w:r>
-        <w:rPr>
-          <w:noProof/>
-          <w:lang w:val="hr-HR"/>
-        </w:rPr>
         <w:drawing>
-          <wp:inline distT="0" distB="0" distL="0" distR="0" wp14:anchorId="133A564A" wp14:editId="46B69E05">
-            <wp:extent cx="4869716" cy="4257675"/>
-            <wp:effectExtent l="0" t="0" r="0" b="0"/>
-            <wp:docPr id="1900113921" name="Slika 20"/>
+          <wp:inline distT="0" distB="0" distL="0" distR="0" wp14:anchorId="070EF4A6" wp14:editId="3FF3058C">
+            <wp:extent cx="3637426" cy="6276975"/>
+            <wp:effectExtent l="0" t="0" r="1270" b="0"/>
+            <wp:docPr id="370440197" name="Slika 6"/>
             <wp:cNvGraphicFramePr>
               <a:graphicFrameLocks xmlns:a="http://schemas.openxmlformats.org/drawingml/2006/main" noChangeAspect="1"/>
             </wp:cNvGraphicFramePr>
@@ -434,7 +318,7 @@
               <a:graphicData uri="http://schemas.openxmlformats.org/drawingml/2006/picture">
                 <pic:pic xmlns:pic="http://schemas.openxmlformats.org/drawingml/2006/picture">
                   <pic:nvPicPr>
-                    <pic:cNvPr id="0" name="Picture 72"/>
+                    <pic:cNvPr id="0" name="Picture 20"/>
                     <pic:cNvPicPr>
                       <a:picLocks noChangeAspect="1" noChangeArrowheads="1"/>
                     </pic:cNvPicPr>
@@ -455,7 +339,7 @@
                   <pic:spPr bwMode="auto">
                     <a:xfrm>
                       <a:off x="0" y="0"/>
-                      <a:ext cx="4873014" cy="4260559"/>
+                      <a:ext cx="3657242" cy="6311170"/>
                     </a:xfrm>
                     <a:prstGeom prst="rect">
                       <a:avLst/>
@@ -471,6 +355,444 @@
           </wp:inline>
         </w:drawing>
       </w:r>
+    </w:p>
+    <w:p>
+      <w:pPr>
+        <w:jc w:val="center"/>
+        <w:rPr>
+          <w:lang w:val="hr-HR"/>
+        </w:rPr>
+      </w:pPr>
+      <w:r>
+        <w:rPr>
+          <w:lang w:val="hr-HR"/>
+        </w:rPr>
+        <w:lastRenderedPageBreak/>
+        <w:drawing>
+          <wp:inline distT="0" distB="0" distL="0" distR="0" wp14:anchorId="56EA0E2A" wp14:editId="7CBB7E8E">
+            <wp:extent cx="2419350" cy="6663128"/>
+            <wp:effectExtent l="0" t="0" r="0" b="0"/>
+            <wp:docPr id="1165421221" name="Slika 8"/>
+            <wp:cNvGraphicFramePr>
+              <a:graphicFrameLocks xmlns:a="http://schemas.openxmlformats.org/drawingml/2006/main" noChangeAspect="1"/>
+            </wp:cNvGraphicFramePr>
+            <a:graphic xmlns:a="http://schemas.openxmlformats.org/drawingml/2006/main">
+              <a:graphicData uri="http://schemas.openxmlformats.org/drawingml/2006/picture">
+                <pic:pic xmlns:pic="http://schemas.openxmlformats.org/drawingml/2006/picture">
+                  <pic:nvPicPr>
+                    <pic:cNvPr id="0" name="Picture 27"/>
+                    <pic:cNvPicPr>
+                      <a:picLocks noChangeAspect="1" noChangeArrowheads="1"/>
+                    </pic:cNvPicPr>
+                  </pic:nvPicPr>
+                  <pic:blipFill>
+                    <a:blip r:embed="rId9" cstate="print">
+                      <a:extLst>
+                        <a:ext uri="{28A0092B-C50C-407E-A947-70E740481C1C}">
+                          <a14:useLocalDpi xmlns:a14="http://schemas.microsoft.com/office/drawing/2010/main" val="0"/>
+                        </a:ext>
+                      </a:extLst>
+                    </a:blip>
+                    <a:srcRect/>
+                    <a:stretch>
+                      <a:fillRect/>
+                    </a:stretch>
+                  </pic:blipFill>
+                  <pic:spPr bwMode="auto">
+                    <a:xfrm>
+                      <a:off x="0" y="0"/>
+                      <a:ext cx="2420541" cy="6666409"/>
+                    </a:xfrm>
+                    <a:prstGeom prst="rect">
+                      <a:avLst/>
+                    </a:prstGeom>
+                    <a:noFill/>
+                    <a:ln>
+                      <a:noFill/>
+                    </a:ln>
+                  </pic:spPr>
+                </pic:pic>
+              </a:graphicData>
+            </a:graphic>
+          </wp:inline>
+        </w:drawing>
+      </w:r>
+    </w:p>
+    <w:p>
+      <w:pPr>
+        <w:jc w:val="center"/>
+        <w:rPr>
+          <w:lang w:val="hr-HR"/>
+        </w:rPr>
+      </w:pPr>
+    </w:p>
+    <w:p>
+      <w:pPr>
+        <w:jc w:val="center"/>
+        <w:rPr>
+          <w:lang w:val="hr-HR"/>
+        </w:rPr>
+      </w:pPr>
+      <w:r>
+        <w:rPr>
+          <w:noProof/>
+          <w:lang w:val="hr-HR"/>
+        </w:rPr>
+        <w:lastRenderedPageBreak/>
+        <w:drawing>
+          <wp:inline distT="0" distB="0" distL="0" distR="0" wp14:anchorId="3C4AC850" wp14:editId="2CD18738">
+            <wp:extent cx="2259434" cy="6057900"/>
+            <wp:effectExtent l="0" t="0" r="7620" b="0"/>
+            <wp:docPr id="197191066" name="Slika 18"/>
+            <wp:cNvGraphicFramePr>
+              <a:graphicFrameLocks xmlns:a="http://schemas.openxmlformats.org/drawingml/2006/main" noChangeAspect="1"/>
+            </wp:cNvGraphicFramePr>
+            <a:graphic xmlns:a="http://schemas.openxmlformats.org/drawingml/2006/main">
+              <a:graphicData uri="http://schemas.openxmlformats.org/drawingml/2006/picture">
+                <pic:pic xmlns:pic="http://schemas.openxmlformats.org/drawingml/2006/picture">
+                  <pic:nvPicPr>
+                    <pic:cNvPr id="0" name="Picture 65"/>
+                    <pic:cNvPicPr>
+                      <a:picLocks noChangeAspect="1" noChangeArrowheads="1"/>
+                    </pic:cNvPicPr>
+                  </pic:nvPicPr>
+                  <pic:blipFill>
+                    <a:blip r:embed="rId10" cstate="print">
+                      <a:extLst>
+                        <a:ext uri="{28A0092B-C50C-407E-A947-70E740481C1C}">
+                          <a14:useLocalDpi xmlns:a14="http://schemas.microsoft.com/office/drawing/2010/main" val="0"/>
+                        </a:ext>
+                      </a:extLst>
+                    </a:blip>
+                    <a:srcRect/>
+                    <a:stretch>
+                      <a:fillRect/>
+                    </a:stretch>
+                  </pic:blipFill>
+                  <pic:spPr bwMode="auto">
+                    <a:xfrm>
+                      <a:off x="0" y="0"/>
+                      <a:ext cx="2265396" cy="6073886"/>
+                    </a:xfrm>
+                    <a:prstGeom prst="rect">
+                      <a:avLst/>
+                    </a:prstGeom>
+                    <a:noFill/>
+                    <a:ln>
+                      <a:noFill/>
+                    </a:ln>
+                  </pic:spPr>
+                </pic:pic>
+              </a:graphicData>
+            </a:graphic>
+          </wp:inline>
+        </w:drawing>
+      </w:r>
+    </w:p>
+    <w:p>
+      <w:pPr>
+        <w:jc w:val="center"/>
+        <w:rPr>
+          <w:lang w:val="hr-HR"/>
+        </w:rPr>
+      </w:pPr>
+    </w:p>
+    <w:p>
+      <w:pPr>
+        <w:jc w:val="center"/>
+        <w:rPr>
+          <w:lang w:val="hr-HR"/>
+        </w:rPr>
+      </w:pPr>
+      <w:r>
+        <w:rPr>
+          <w:lang w:val="hr-HR"/>
+        </w:rPr>
+        <w:lastRenderedPageBreak/>
+        <w:drawing>
+          <wp:inline distT="0" distB="0" distL="0" distR="0" wp14:anchorId="77F7FFF2" wp14:editId="0AE48B2A">
+            <wp:extent cx="1870509" cy="5553075"/>
+            <wp:effectExtent l="0" t="0" r="0" b="0"/>
+            <wp:docPr id="1659708392" name="Slika 10"/>
+            <wp:cNvGraphicFramePr>
+              <a:graphicFrameLocks xmlns:a="http://schemas.openxmlformats.org/drawingml/2006/main" noChangeAspect="1"/>
+            </wp:cNvGraphicFramePr>
+            <a:graphic xmlns:a="http://schemas.openxmlformats.org/drawingml/2006/main">
+              <a:graphicData uri="http://schemas.openxmlformats.org/drawingml/2006/picture">
+                <pic:pic xmlns:pic="http://schemas.openxmlformats.org/drawingml/2006/picture">
+                  <pic:nvPicPr>
+                    <pic:cNvPr id="0" name="Picture 34"/>
+                    <pic:cNvPicPr>
+                      <a:picLocks noChangeAspect="1" noChangeArrowheads="1"/>
+                    </pic:cNvPicPr>
+                  </pic:nvPicPr>
+                  <pic:blipFill>
+                    <a:blip r:embed="rId11" cstate="print">
+                      <a:extLst>
+                        <a:ext uri="{28A0092B-C50C-407E-A947-70E740481C1C}">
+                          <a14:useLocalDpi xmlns:a14="http://schemas.microsoft.com/office/drawing/2010/main" val="0"/>
+                        </a:ext>
+                      </a:extLst>
+                    </a:blip>
+                    <a:srcRect/>
+                    <a:stretch>
+                      <a:fillRect/>
+                    </a:stretch>
+                  </pic:blipFill>
+                  <pic:spPr bwMode="auto">
+                    <a:xfrm>
+                      <a:off x="0" y="0"/>
+                      <a:ext cx="1875683" cy="5568436"/>
+                    </a:xfrm>
+                    <a:prstGeom prst="rect">
+                      <a:avLst/>
+                    </a:prstGeom>
+                    <a:noFill/>
+                    <a:ln>
+                      <a:noFill/>
+                    </a:ln>
+                  </pic:spPr>
+                </pic:pic>
+              </a:graphicData>
+            </a:graphic>
+          </wp:inline>
+        </w:drawing>
+      </w:r>
+    </w:p>
+    <w:p>
+      <w:pPr>
+        <w:jc w:val="center"/>
+        <w:rPr>
+          <w:lang w:val="hr-HR"/>
+        </w:rPr>
+      </w:pPr>
+      <w:r>
+        <w:rPr>
+          <w:lang w:val="hr-HR"/>
+        </w:rPr>
+        <w:lastRenderedPageBreak/>
+        <w:drawing>
+          <wp:inline distT="0" distB="0" distL="0" distR="0" wp14:anchorId="621C96EB" wp14:editId="283B6D80">
+            <wp:extent cx="2867025" cy="8027670"/>
+            <wp:effectExtent l="0" t="0" r="0" b="0"/>
+            <wp:docPr id="1214035368" name="Slika 12"/>
+            <wp:cNvGraphicFramePr>
+              <a:graphicFrameLocks xmlns:a="http://schemas.openxmlformats.org/drawingml/2006/main" noChangeAspect="1"/>
+            </wp:cNvGraphicFramePr>
+            <a:graphic xmlns:a="http://schemas.openxmlformats.org/drawingml/2006/main">
+              <a:graphicData uri="http://schemas.openxmlformats.org/drawingml/2006/picture">
+                <pic:pic xmlns:pic="http://schemas.openxmlformats.org/drawingml/2006/picture">
+                  <pic:nvPicPr>
+                    <pic:cNvPr id="0" name="Picture 41"/>
+                    <pic:cNvPicPr>
+                      <a:picLocks noChangeAspect="1" noChangeArrowheads="1"/>
+                    </pic:cNvPicPr>
+                  </pic:nvPicPr>
+                  <pic:blipFill>
+                    <a:blip r:embed="rId12" cstate="print">
+                      <a:extLst>
+                        <a:ext uri="{28A0092B-C50C-407E-A947-70E740481C1C}">
+                          <a14:useLocalDpi xmlns:a14="http://schemas.microsoft.com/office/drawing/2010/main" val="0"/>
+                        </a:ext>
+                      </a:extLst>
+                    </a:blip>
+                    <a:srcRect/>
+                    <a:stretch>
+                      <a:fillRect/>
+                    </a:stretch>
+                  </pic:blipFill>
+                  <pic:spPr bwMode="auto">
+                    <a:xfrm>
+                      <a:off x="0" y="0"/>
+                      <a:ext cx="2868638" cy="8032187"/>
+                    </a:xfrm>
+                    <a:prstGeom prst="rect">
+                      <a:avLst/>
+                    </a:prstGeom>
+                    <a:noFill/>
+                    <a:ln>
+                      <a:noFill/>
+                    </a:ln>
+                  </pic:spPr>
+                </pic:pic>
+              </a:graphicData>
+            </a:graphic>
+          </wp:inline>
+        </w:drawing>
+      </w:r>
+    </w:p>
+    <w:p>
+      <w:pPr>
+        <w:jc w:val="center"/>
+        <w:rPr>
+          <w:lang w:val="hr-HR"/>
+        </w:rPr>
+      </w:pPr>
+    </w:p>
+    <w:p>
+      <w:pPr>
+        <w:jc w:val="center"/>
+        <w:rPr>
+          <w:lang w:val="hr-HR"/>
+        </w:rPr>
+      </w:pPr>
+      <w:r>
+        <w:rPr>
+          <w:lang w:val="hr-HR"/>
+        </w:rPr>
+        <w:lastRenderedPageBreak/>
+        <w:drawing>
+          <wp:inline distT="0" distB="0" distL="0" distR="0" wp14:anchorId="383CFD3A" wp14:editId="35F2372C">
+            <wp:extent cx="3171825" cy="8594623"/>
+            <wp:effectExtent l="0" t="0" r="0" b="0"/>
+            <wp:docPr id="953957449" name="Slika 14"/>
+            <wp:cNvGraphicFramePr>
+              <a:graphicFrameLocks xmlns:a="http://schemas.openxmlformats.org/drawingml/2006/main" noChangeAspect="1"/>
+            </wp:cNvGraphicFramePr>
+            <a:graphic xmlns:a="http://schemas.openxmlformats.org/drawingml/2006/main">
+              <a:graphicData uri="http://schemas.openxmlformats.org/drawingml/2006/picture">
+                <pic:pic xmlns:pic="http://schemas.openxmlformats.org/drawingml/2006/picture">
+                  <pic:nvPicPr>
+                    <pic:cNvPr id="0" name="Picture 48"/>
+                    <pic:cNvPicPr>
+                      <a:picLocks noChangeAspect="1" noChangeArrowheads="1"/>
+                    </pic:cNvPicPr>
+                  </pic:nvPicPr>
+                  <pic:blipFill>
+                    <a:blip r:embed="rId13" cstate="print">
+                      <a:extLst>
+                        <a:ext uri="{28A0092B-C50C-407E-A947-70E740481C1C}">
+                          <a14:useLocalDpi xmlns:a14="http://schemas.microsoft.com/office/drawing/2010/main" val="0"/>
+                        </a:ext>
+                      </a:extLst>
+                    </a:blip>
+                    <a:srcRect/>
+                    <a:stretch>
+                      <a:fillRect/>
+                    </a:stretch>
+                  </pic:blipFill>
+                  <pic:spPr bwMode="auto">
+                    <a:xfrm>
+                      <a:off x="0" y="0"/>
+                      <a:ext cx="3173719" cy="8599755"/>
+                    </a:xfrm>
+                    <a:prstGeom prst="rect">
+                      <a:avLst/>
+                    </a:prstGeom>
+                    <a:noFill/>
+                    <a:ln>
+                      <a:noFill/>
+                    </a:ln>
+                  </pic:spPr>
+                </pic:pic>
+              </a:graphicData>
+            </a:graphic>
+          </wp:inline>
+        </w:drawing>
+      </w:r>
+    </w:p>
+    <w:p>
+      <w:pPr>
+        <w:jc w:val="center"/>
+        <w:rPr>
+          <w:lang w:val="hr-HR"/>
+        </w:rPr>
+      </w:pPr>
+    </w:p>
+    <w:p>
+      <w:pPr>
+        <w:jc w:val="center"/>
+        <w:rPr>
+          <w:lang w:val="hr-HR"/>
+        </w:rPr>
+      </w:pPr>
+    </w:p>
+    <w:p>
+      <w:pPr>
+        <w:jc w:val="center"/>
+        <w:rPr>
+          <w:lang w:val="hr-HR"/>
+        </w:rPr>
+      </w:pPr>
+    </w:p>
+    <w:p>
+      <w:pPr>
+        <w:jc w:val="center"/>
+        <w:rPr>
+          <w:lang w:val="hr-HR"/>
+        </w:rPr>
+      </w:pPr>
+    </w:p>
+    <w:p>
+      <w:pPr>
+        <w:jc w:val="center"/>
+        <w:rPr>
+          <w:lang w:val="hr-HR"/>
+        </w:rPr>
+      </w:pPr>
+    </w:p>
+    <w:p>
+      <w:pPr>
+        <w:jc w:val="center"/>
+        <w:rPr>
+          <w:lang w:val="hr-HR"/>
+        </w:rPr>
+      </w:pPr>
+    </w:p>
+    <w:p>
+      <w:pPr>
+        <w:jc w:val="center"/>
+        <w:rPr>
+          <w:lang w:val="hr-HR"/>
+        </w:rPr>
+      </w:pPr>
+    </w:p>
+    <w:p>
+      <w:pPr>
+        <w:jc w:val="center"/>
+        <w:rPr>
+          <w:lang w:val="hr-HR"/>
+        </w:rPr>
+      </w:pPr>
+    </w:p>
+    <w:p>
+      <w:pPr>
+        <w:jc w:val="center"/>
+        <w:rPr>
+          <w:lang w:val="hr-HR"/>
+        </w:rPr>
+      </w:pPr>
+    </w:p>
+    <w:p>
+      <w:pPr>
+        <w:jc w:val="center"/>
+        <w:rPr>
+          <w:lang w:val="hr-HR"/>
+        </w:rPr>
+      </w:pPr>
+    </w:p>
+    <w:p>
+      <w:pPr>
+        <w:jc w:val="center"/>
+        <w:rPr>
+          <w:lang w:val="hr-HR"/>
+        </w:rPr>
+      </w:pPr>
+    </w:p>
+    <w:p>
+      <w:pPr>
+        <w:jc w:val="center"/>
+        <w:rPr>
+          <w:lang w:val="hr-HR"/>
+        </w:rPr>
+      </w:pPr>
+    </w:p>
+    <w:p>
+      <w:pPr>
+        <w:rPr>
+          <w:lang w:val="hr-HR"/>
+        </w:rPr>
+      </w:pPr>
     </w:p>
     <w:p>
       <w:pPr>
@@ -1105,7 +1427,6 @@
   <w:style w:type="character" w:default="1" w:styleId="Zadanifontodlomka">
     <w:name w:val="Default Paragraph Font"/>
     <w:uiPriority w:val="1"/>
-    <w:semiHidden/>
     <w:unhideWhenUsed/>
   </w:style>
   <w:style w:type="table" w:default="1" w:styleId="Obinatablica">

</xml_diff>